<commit_message>
Ground profile story in verified novel chapters
</commit_message>
<xml_diff>
--- a/public/documents/김건희_자기소개서.docx
+++ b/public/documents/김건희_자기소개서.docx
@@ -11,14 +11,11 @@
       </w:r>
     </w:p>
     <w:p>
-      <w:pPr>
-        <w:spacing w:after="280"/>
-      </w:pPr>
       <w:r>
         <w:rPr>
           <w:b/>
         </w:rPr>
-        <w:t>김건희 · 고난에서 재시도와 협업으로 이어진 이야기</w:t>
+        <w:t>김건희 · 계획이 달라져도 다시 방법을 찾는 과정</w:t>
       </w:r>
     </w:p>
     <w:p>
@@ -32,26 +29,23 @@
     <w:tbl>
       <w:tblPr>
         <w:tblW w:type="auto" w:w="0"/>
-        <w:tblLayout w:type="fixed"/>
         <w:tblLook w:firstColumn="1" w:firstRow="1" w:lastColumn="0" w:lastRow="0" w:noHBand="0" w:noVBand="1" w:val="04A0"/>
       </w:tblPr>
       <w:tblGrid>
-        <w:gridCol w:w="1944"/>
-        <w:gridCol w:w="7920"/>
+        <w:gridCol w:w="4968"/>
+        <w:gridCol w:w="4968"/>
       </w:tblGrid>
       <w:tr>
         <w:tc>
           <w:tcPr>
             <w:tcW w:type="dxa" w:w="4968"/>
-            <w:vAlign w:val="center"/>
             <w:tcBorders>
               <w:top w:val="single" w:sz="4" w:color="D9D9D9"/>
               <w:left w:val="single" w:sz="4" w:color="D9D9D9"/>
               <w:bottom w:val="single" w:sz="4" w:color="D9D9D9"/>
               <w:right w:val="single" w:sz="4" w:color="D9D9D9"/>
-              <w:insideH w:val="single" w:sz="4" w:color="D9D9D9"/>
-              <w:insideV w:val="single" w:sz="4" w:color="D9D9D9"/>
             </w:tcBorders>
+            <w:vAlign w:val="center"/>
             <w:shd w:fill="E5EAE5"/>
           </w:tcPr>
           <w:p>
@@ -66,15 +60,13 @@
         <w:tc>
           <w:tcPr>
             <w:tcW w:type="dxa" w:w="4968"/>
-            <w:vAlign w:val="center"/>
             <w:tcBorders>
               <w:top w:val="single" w:sz="4" w:color="D9D9D9"/>
               <w:left w:val="single" w:sz="4" w:color="D9D9D9"/>
               <w:bottom w:val="single" w:sz="4" w:color="D9D9D9"/>
               <w:right w:val="single" w:sz="4" w:color="D9D9D9"/>
-              <w:insideH w:val="single" w:sz="4" w:color="D9D9D9"/>
-              <w:insideV w:val="single" w:sz="4" w:color="D9D9D9"/>
             </w:tcBorders>
+            <w:vAlign w:val="center"/>
           </w:tcPr>
           <w:p>
             <w:r>
@@ -87,15 +79,13 @@
         <w:tc>
           <w:tcPr>
             <w:tcW w:type="dxa" w:w="4968"/>
-            <w:vAlign w:val="center"/>
             <w:tcBorders>
               <w:top w:val="single" w:sz="4" w:color="D9D9D9"/>
               <w:left w:val="single" w:sz="4" w:color="D9D9D9"/>
               <w:bottom w:val="single" w:sz="4" w:color="D9D9D9"/>
               <w:right w:val="single" w:sz="4" w:color="D9D9D9"/>
-              <w:insideH w:val="single" w:sz="4" w:color="D9D9D9"/>
-              <w:insideV w:val="single" w:sz="4" w:color="D9D9D9"/>
             </w:tcBorders>
+            <w:vAlign w:val="center"/>
             <w:shd w:fill="E5EAE5"/>
           </w:tcPr>
           <w:p>
@@ -110,15 +100,13 @@
         <w:tc>
           <w:tcPr>
             <w:tcW w:type="dxa" w:w="4968"/>
-            <w:vAlign w:val="center"/>
             <w:tcBorders>
               <w:top w:val="single" w:sz="4" w:color="D9D9D9"/>
               <w:left w:val="single" w:sz="4" w:color="D9D9D9"/>
               <w:bottom w:val="single" w:sz="4" w:color="D9D9D9"/>
               <w:right w:val="single" w:sz="4" w:color="D9D9D9"/>
-              <w:insideH w:val="single" w:sz="4" w:color="D9D9D9"/>
-              <w:insideV w:val="single" w:sz="4" w:color="D9D9D9"/>
             </w:tcBorders>
+            <w:vAlign w:val="center"/>
           </w:tcPr>
           <w:p>
             <w:r>
@@ -131,15 +119,13 @@
         <w:tc>
           <w:tcPr>
             <w:tcW w:type="dxa" w:w="4968"/>
-            <w:vAlign w:val="center"/>
             <w:tcBorders>
               <w:top w:val="single" w:sz="4" w:color="D9D9D9"/>
               <w:left w:val="single" w:sz="4" w:color="D9D9D9"/>
               <w:bottom w:val="single" w:sz="4" w:color="D9D9D9"/>
               <w:right w:val="single" w:sz="4" w:color="D9D9D9"/>
-              <w:insideH w:val="single" w:sz="4" w:color="D9D9D9"/>
-              <w:insideV w:val="single" w:sz="4" w:color="D9D9D9"/>
             </w:tcBorders>
+            <w:vAlign w:val="center"/>
             <w:shd w:fill="E5EAE5"/>
           </w:tcPr>
           <w:p>
@@ -154,15 +140,13 @@
         <w:tc>
           <w:tcPr>
             <w:tcW w:type="dxa" w:w="4968"/>
-            <w:vAlign w:val="center"/>
             <w:tcBorders>
               <w:top w:val="single" w:sz="4" w:color="D9D9D9"/>
               <w:left w:val="single" w:sz="4" w:color="D9D9D9"/>
               <w:bottom w:val="single" w:sz="4" w:color="D9D9D9"/>
               <w:right w:val="single" w:sz="4" w:color="D9D9D9"/>
-              <w:insideH w:val="single" w:sz="4" w:color="D9D9D9"/>
-              <w:insideV w:val="single" w:sz="4" w:color="D9D9D9"/>
             </w:tcBorders>
+            <w:vAlign w:val="center"/>
           </w:tcPr>
           <w:p>
             <w:r>
@@ -186,7 +170,7 @@
         <w:rPr>
           <w:b/>
         </w:rPr>
-        <w:t>계획대로 되지 않았던 스마트 미러</w:t>
+        <w:t>계획이 달라진 자리에서 순서를 다시 세우기</w:t>
       </w:r>
     </w:p>
     <w:p>
@@ -196,12 +180,12 @@
     </w:p>
     <w:p>
       <w:r>
-        <w:t>2018년, 대학교 졸업과제로 스마트 미러를 만들던 중 함께하던 인원이 개인 사정으로 빠졌습니다. 남은 인원이 역할과 일정을 다시 정해야 했고, 저는 그 빈자리를 책임지며 프로젝트를 이어갔습니다. 사람마다 급한 사정이 있을 수 있다는 점을 이해하면서도, 남은 일을 어떻게 마무리할지 생각해야 했습니다.</w:t>
+        <w:t>2018년, 대학교 졸업과제로 스마트 미러를 만들던 중 함께하던 인원이 개인 사정으로 빠졌습니다. 남은 인원이 역할과 일정을 다시 정해야 했고, 저는 그 빈자리를 맡아 프로젝트를 이어갔습니다. 사람마다 급한 사정이 있을 수 있다는 점을 이해하면서도, 지금 남은 일을 어떻게 마무리할지 판단해야 했습니다.</w:t>
       </w:r>
     </w:p>
     <w:p>
       <w:r>
-        <w:t>제가 바꾼 것은 일의 순서였습니다. 할 수 있는 일을 진행하면서 꼭 필요한 기능부터 완성하는 방향으로 우선순위를 정했습니다. 이 경험은 2026년 9월 10일 리추얼에도 남아 있습니다. 계획을 지키는 것만큼 상황에 맞게 다시 세우는 일도 중요하다는 것을 배웠습니다. 제게 자기조절력은 이런 상황에서 가능한 행동을 찾아 실행하는 태도입니다.</w:t>
+        <w:t>제가 바꾼 것은 일의 순서였습니다. 한 번에 모든 문제를 해결하려 하기보다 할 수 있는 일을 나누고, 꼭 필요한 기능부터 완성하는 방향으로 우선순위를 정했습니다. 이 경험은 2026년 9월 10일 리추얼에서 다시 돌아본 장면이기도 합니다. 소설 1장의 “첫 번째 로그”가 보여 주는 출발점처럼, 제게 자기조절력은 계획이 달라졌을 때 확인한 사실과 다음 행동을 구분하고 실행 순서를 다시 세우는 태도입니다.</w:t>
       </w:r>
     </w:p>
     <w:p>
@@ -209,12 +193,15 @@
         <w:rPr>
           <w:b/>
         </w:rPr>
-        <w:t>드러난 능력: 자기조절력</w:t>
+        <w:t xml:space="preserve">드러난 능력: </w:t>
+      </w:r>
+      <w:r>
+        <w:t>자기조절력</w:t>
       </w:r>
     </w:p>
     <w:p>
       <w:r>
-        <w:t>근거: 9번 서사 6·8절; 리추얼 2026-09-10 open</w:t>
+        <w:t>근거: 11번 소설 1장 구조; 9번 확정 서사 6절; 리추얼 2026-09-10 open. 소설의 계절·작업실·대화·장치 세부 묘사는 사용하지 않음</w:t>
       </w:r>
     </w:p>
     <w:p>
@@ -230,22 +217,17 @@
         <w:rPr>
           <w:b/>
         </w:rPr>
-        <w:t>같은 자리에서 다시 시도하기</w:t>
+        <w:t>배운 기반 위에서 다시 확인하기</w:t>
       </w:r>
     </w:p>
     <w:p>
       <w:r>
-        <w:t>전자정보통신공학 전공에서 이미 통신·네트워크를 배웠고, 2026년에는 이를 심화 실습했습니다. 익숙한 기초가 있다고 해서 모든 실습이 쉽게 풀린 것은 아닙니다. 8월 27일에는 따라가던 실습이 되지 않아 전부 초기화하고 처음부터 다시 진행했습니다. 잘되지 않을 때 같은 방법만 반복하기보다, 다시 시작할 방법을 선택했습니다.</w:t>
+        <w:t>전자정보통신공학 전공에서 이미 통신·네트워크를 배웠고, 2026년에는 이를 심화 실습했습니다. 소설 8장 “끊어진 패킷”의 핵심도 새로운 분야를 처음 만난 이야기가 아니라, 배운 지식이 실제 연결을 보장하지 않을 때 확인할 조건을 다시 찾는 과정입니다.</w:t>
       </w:r>
     </w:p>
     <w:p>
       <w:r>
-        <w:t>2026년 8월 11일에는 하루 조장으로서 팀원들의 말을 정리하는 일을 오늘의 행동으로 정했습니다. 동료들은 제가 경청하고 장황한 이야기를 정리해 주었다고 말했습니다. 이런 작은 행동과 피드백을 남겨 두니, 막연한 장점 대신 실제로 무엇을 했는지 돌아볼 수 있었습니다. 기록은 잘한 날만 모으기 위한 것이 아니라 다음 행동을 고르기 위한 기준이 되었습니다.</w:t>
-      </w:r>
-    </w:p>
-    <w:p>
-      <w:r>
-        <w:t>8월 31일에는 컨디션이 좋지 않아 내용이 잘 들어오지 않았습니다. 그날은 모든 내용을 타이핑하며 최대한 이해하려고 했습니다. 매번 완벽하게 해냈다고 말할 수는 없습니다. 다만 그날 할 수 있는 행동을 정하고 이어가려고 했습니다. “어떤 것이든 최선을 다하며 임하다 보면 언젠가 좀 더 다듬어진 내가 될 수 있을 것”이라는 기록은, 제가 다시 시도한 이유를 보여줍니다. 이것이 제 자기동기력의 근거입니다.</w:t>
+        <w:t>8월 27일에는 진행하던 실습이 되지 않아 전부 초기화하고 처음부터 다시 수행했습니다. 잘되지 않을 때 같은 방법만 반복하기보다 다시 시작할 방법을 선택했습니다. 8월 31일에는 컨디션이 좋지 않아 내용이 잘 들어오지 않았지만, 모든 내용을 타이핑하며 그날 이해할 수 있는 만큼 따라갔습니다. 매번 완벽하게 해결했다고 말할 수는 없습니다. 다만 끝나지 않은 일과 아무것도 하지 않은 일을 같게 두지 않고, 다음에 확인할 행동을 남겼습니다. 이것이 제 자기동기력의 근거입니다.</w:t>
       </w:r>
     </w:p>
     <w:p>
@@ -253,12 +235,15 @@
         <w:rPr>
           <w:b/>
         </w:rPr>
-        <w:t>드러난 능력: 자기동기력</w:t>
+        <w:t xml:space="preserve">드러난 능력: </w:t>
+      </w:r>
+      <w:r>
+        <w:t>자기동기력</w:t>
       </w:r>
     </w:p>
     <w:p>
       <w:r>
-        <w:t>근거: 리추얼 2026-08-27 close, 2026-08-31 close, 2026-08-11 open; 사용자 전공 설명</w:t>
+        <w:t>근거: 11번 소설 8장 구조; 사용자 전공 설명; 리추얼 2026-08-27 close, 2026-08-31 close. 소설의 토폴로지·명령·장비 세부 묘사는 사실로 사용하지 않음</w:t>
       </w:r>
     </w:p>
     <w:p>
@@ -266,7 +251,7 @@
         <w:pStyle w:val="Heading1"/>
       </w:pPr>
       <w:r>
-        <w:t>2026-09-28 · 함께 확인해 달라고 부탁한 날</w:t>
+        <w:t>2026-09-28~10-01 · 함께 확인하고 설명한 기록</w:t>
       </w:r>
     </w:p>
     <w:p>
@@ -274,22 +259,22 @@
         <w:rPr>
           <w:b/>
         </w:rPr>
-        <w:t>혼자 책임지는 데서 함께 해결하는 쪽으로</w:t>
+        <w:t>혼자 떠안기보다 함께 해결하는 현재</w:t>
       </w:r>
     </w:p>
     <w:p>
       <w:r>
-        <w:t>9월 28일에는 과제의 규모가 커지자 조원들에게 함께 확인해 달라고 부탁했습니다. 이 장면을 돌아보며 책임감을 혼자 떠안는 일로만 여기지 않으려 합니다. 먼저 찾아보고, 막히는 부분을 공유하고, 제가 아는 내용은 설명하는 쪽으로 일하는 방식을 넓혀 왔습니다.</w:t>
+        <w:t>9월 28일에는 과제의 규모가 커지자 조원들에게 함께 확인해 달라고 부탁했습니다. 책임감을 모든 문제를 혼자 떠안는 일로만 여기지 않기 위해서였습니다. 먼저 찾아본 내용을 공유하고, 막힌 부분은 도움을 요청하며, 제가 아는 것은 설명하는 쪽으로 일하는 방식을 넓혀 왔습니다.</w:t>
       </w:r>
     </w:p>
     <w:p>
       <w:r>
-        <w:t>도움을 주는 과정에서 저 역시 다시 배우게 됩니다. 8월 13일에는 기밀성과 무결성, 암호화 개념을 설명했고, 동료로부터 이해에 도움이 되었다는 말을 들었습니다. 10월 1일에는 막힌 부분을 돌파할 실마리를 주었다는 감사를 받았습니다. 상대의 질문을 듣고 이해한 내용을 나누는 행동이 제 대인관계력을 보여줍니다. 기술을 아는 것과 함께 일하기 좋은 사람으로 성장하는 일을 연결하고 싶습니다.</w:t>
+        <w:t>8월 13일에는 기밀성과 무결성, 암호화 개념을 설명했고 동료로부터 이해에 도움이 되었다는 말을 들었습니다. 10월 1일에는 막힌 부분을 돌파할 실마리를 주었다는 감사를 받았습니다. 상대의 질문을 듣고 이해한 내용을 나누는 행동이 제 대인관계력을 보여 줍니다.</w:t>
       </w:r>
     </w:p>
     <w:p>
       <w:r>
-        <w:t>앞으로도 기술을 꾸준히 익히면서 팀원이 편하게 질문할 수 있고, 어려운 상황에서 함께 해결의 실마리를 찾는 동료로 성장하겠습니다.</w:t>
+        <w:t>소설 12장 “마지막이 아닌 배포”처럼 지금의 포트폴리오도 완성됐다고 선언하는 자리가 아니라, 확인된 현재와 아직 모르는 부분을 나누어 기록하는 자리입니다. 기록은 잘한 날만 모으는 장식이 아니라 다음 행동을 고르는 기준이 되었습니다. 앞으로도 기술을 꾸준히 익히면서 팀원이 편하게 질문할 수 있고, 어려운 상황에서 함께 해결의 실마리를 찾는 동료로 성장하겠습니다.</w:t>
       </w:r>
     </w:p>
     <w:p>
@@ -297,12 +282,15 @@
         <w:rPr>
           <w:b/>
         </w:rPr>
-        <w:t>드러난 능력: 대인관계력</w:t>
+        <w:t xml:space="preserve">드러난 능력: </w:t>
+      </w:r>
+      <w:r>
+        <w:t>대인관계력</w:t>
       </w:r>
     </w:p>
     <w:p>
       <w:r>
-        <w:t>근거: 9번 서사 6·8절; 리추얼 2026-09-28 close, 2026-08-13 close, 2026-10-01 close</w:t>
+        <w:t>근거: 11번 소설 12장 구조; 9번 확정 서사 6·8절; 리추얼 2026-09-28 close, 2026-08-13 close, 2026-10-01 close</w:t>
       </w:r>
     </w:p>
     <w:p>
@@ -310,12 +298,12 @@
         <w:pStyle w:val="Heading1"/>
       </w:pPr>
       <w:r>
-        <w:t>근거와 확인 상태</w:t>
+        <w:t>원문 대조 상태</w:t>
       </w:r>
     </w:p>
     <w:p>
       <w:r>
-        <w:t>9번 확정 서사와 날짜가 있는 리추얼 원본을 기준으로 구성한 사실 기반 편집안. 11번 소설 원문은 확보되지 않아 소설에서 직접 가져온 문장으로 표시하지 않았습니다. 첫·마지막 문장은 2026-10-07 확정 문서의 표현을 유지했습니다.</w:t>
+        <w:t>11번 소설에서 1장 「첫 번째 로그」, 8장 「끊어진 패킷」, 12장 「마지막이 아닌 배포」의 구조를 골랐습니다. 9번 확정 서사와 리추얼 기록으로 사실을 대조하고, 소설의 대화·감각 묘사·정확한 계절·기술 세부는 각색으로 보아 사실 문장에서 제외했습니다. 첫·마지막 문장은 2026-10-07 본인이 확정한 표현을 유지했습니다.</w:t>
       </w:r>
     </w:p>
     <w:sectPr>

</xml_diff>